<commit_message>
HIT package: better table layout (fixed column widths, bold headers)
- Week-schedule tables (EN + HE) now use fixed column widths: a narrow,
  centered week-number column and a wide topics column (no more half-width
  number column)
- Bold teal headers with a light shaded fill; the header row repeats when a
  table spans a page break
- Committee questionnaire table given fixed two-column widths and justified
  (RTL-start) cells

Co-Authored-By: Claude Opus 4.8 <noreply@anthropic.com>
</commit_message>
<xml_diff>
--- a/hit-catalogue/committee_questionnaire.docx
+++ b/hit-catalogue/committee_questionnaire.docx
@@ -58,6 +58,7 @@
         <w:jc w:val="right"/>
         <w:tblLook w:firstColumn="1" w:firstRow="1" w:lastColumn="0" w:lastRow="0" w:noHBand="0" w:noVBand="1" w:val="04A0"/>
         <w:bidiVisual/>
+        <w:tblLayout w:type="fixed"/>
       </w:tblPr>
       <w:tblGrid>
         <w:gridCol w:w="4320"/>
@@ -66,12 +67,12 @@
       <w:tr>
         <w:tc>
           <w:tcPr>
-            <w:tcW w:type="dxa" w:w="4320"/>
+            <w:tcW w:type="dxa" w:w="3685"/>
           </w:tcPr>
           <w:p>
             <w:pPr>
               <w:bidi/>
-              <w:jc w:val="right"/>
+              <w:jc w:val="both"/>
             </w:pPr>
             <w:r>
               <w:rPr>
@@ -86,12 +87,12 @@
         </w:tc>
         <w:tc>
           <w:tcPr>
-            <w:tcW w:type="dxa" w:w="4320"/>
+            <w:tcW w:type="dxa" w:w="5159"/>
           </w:tcPr>
           <w:p>
             <w:pPr>
               <w:bidi/>
-              <w:jc w:val="right"/>
+              <w:jc w:val="both"/>
             </w:pPr>
             <w:r>
               <w:rPr>
@@ -108,12 +109,12 @@
       <w:tr>
         <w:tc>
           <w:tcPr>
-            <w:tcW w:type="dxa" w:w="4320"/>
+            <w:tcW w:type="dxa" w:w="3685"/>
           </w:tcPr>
           <w:p>
             <w:pPr>
               <w:bidi/>
-              <w:jc w:val="right"/>
+              <w:jc w:val="both"/>
             </w:pPr>
             <w:r>
               <w:rPr>
@@ -128,12 +129,12 @@
         </w:tc>
         <w:tc>
           <w:tcPr>
-            <w:tcW w:type="dxa" w:w="4320"/>
+            <w:tcW w:type="dxa" w:w="5159"/>
           </w:tcPr>
           <w:p>
             <w:pPr>
               <w:bidi/>
-              <w:jc w:val="right"/>
+              <w:jc w:val="both"/>
             </w:pPr>
             <w:r>
               <w:rPr>
@@ -150,12 +151,12 @@
       <w:tr>
         <w:tc>
           <w:tcPr>
-            <w:tcW w:type="dxa" w:w="4320"/>
+            <w:tcW w:type="dxa" w:w="3685"/>
           </w:tcPr>
           <w:p>
             <w:pPr>
               <w:bidi/>
-              <w:jc w:val="right"/>
+              <w:jc w:val="both"/>
             </w:pPr>
             <w:r>
               <w:rPr>
@@ -170,12 +171,12 @@
         </w:tc>
         <w:tc>
           <w:tcPr>
-            <w:tcW w:type="dxa" w:w="4320"/>
+            <w:tcW w:type="dxa" w:w="5159"/>
           </w:tcPr>
           <w:p>
             <w:pPr>
               <w:bidi/>
-              <w:jc w:val="right"/>
+              <w:jc w:val="both"/>
             </w:pPr>
             <w:r>
               <w:rPr>
@@ -192,12 +193,12 @@
       <w:tr>
         <w:tc>
           <w:tcPr>
-            <w:tcW w:type="dxa" w:w="4320"/>
+            <w:tcW w:type="dxa" w:w="3685"/>
           </w:tcPr>
           <w:p>
             <w:pPr>
               <w:bidi/>
-              <w:jc w:val="right"/>
+              <w:jc w:val="both"/>
             </w:pPr>
             <w:r>
               <w:rPr>
@@ -212,12 +213,12 @@
         </w:tc>
         <w:tc>
           <w:tcPr>
-            <w:tcW w:type="dxa" w:w="4320"/>
+            <w:tcW w:type="dxa" w:w="5159"/>
           </w:tcPr>
           <w:p>
             <w:pPr>
               <w:bidi/>
-              <w:jc w:val="right"/>
+              <w:jc w:val="both"/>
             </w:pPr>
             <w:r>
               <w:rPr>
@@ -233,12 +234,12 @@
       <w:tr>
         <w:tc>
           <w:tcPr>
-            <w:tcW w:type="dxa" w:w="4320"/>
+            <w:tcW w:type="dxa" w:w="3685"/>
           </w:tcPr>
           <w:p>
             <w:pPr>
               <w:bidi/>
-              <w:jc w:val="right"/>
+              <w:jc w:val="both"/>
             </w:pPr>
             <w:r>
               <w:rPr>
@@ -253,12 +254,12 @@
         </w:tc>
         <w:tc>
           <w:tcPr>
-            <w:tcW w:type="dxa" w:w="4320"/>
+            <w:tcW w:type="dxa" w:w="5159"/>
           </w:tcPr>
           <w:p>
             <w:pPr>
               <w:bidi/>
-              <w:jc w:val="right"/>
+              <w:jc w:val="both"/>
             </w:pPr>
             <w:r>
               <w:rPr>
@@ -275,12 +276,12 @@
       <w:tr>
         <w:tc>
           <w:tcPr>
-            <w:tcW w:type="dxa" w:w="4320"/>
+            <w:tcW w:type="dxa" w:w="3685"/>
           </w:tcPr>
           <w:p>
             <w:pPr>
               <w:bidi/>
-              <w:jc w:val="right"/>
+              <w:jc w:val="both"/>
             </w:pPr>
             <w:r>
               <w:rPr>
@@ -295,12 +296,12 @@
         </w:tc>
         <w:tc>
           <w:tcPr>
-            <w:tcW w:type="dxa" w:w="4320"/>
+            <w:tcW w:type="dxa" w:w="5159"/>
           </w:tcPr>
           <w:p>
             <w:pPr>
               <w:bidi/>
-              <w:jc w:val="right"/>
+              <w:jc w:val="both"/>
             </w:pPr>
             <w:r>
               <w:rPr>
@@ -317,12 +318,12 @@
       <w:tr>
         <w:tc>
           <w:tcPr>
-            <w:tcW w:type="dxa" w:w="4320"/>
+            <w:tcW w:type="dxa" w:w="3685"/>
           </w:tcPr>
           <w:p>
             <w:pPr>
               <w:bidi/>
-              <w:jc w:val="right"/>
+              <w:jc w:val="both"/>
             </w:pPr>
             <w:r>
               <w:rPr>
@@ -337,12 +338,12 @@
         </w:tc>
         <w:tc>
           <w:tcPr>
-            <w:tcW w:type="dxa" w:w="4320"/>
+            <w:tcW w:type="dxa" w:w="5159"/>
           </w:tcPr>
           <w:p>
             <w:pPr>
               <w:bidi/>
-              <w:jc w:val="right"/>
+              <w:jc w:val="both"/>
             </w:pPr>
             <w:r>
               <w:rPr>
@@ -359,12 +360,12 @@
       <w:tr>
         <w:tc>
           <w:tcPr>
-            <w:tcW w:type="dxa" w:w="4320"/>
+            <w:tcW w:type="dxa" w:w="3685"/>
           </w:tcPr>
           <w:p>
             <w:pPr>
               <w:bidi/>
-              <w:jc w:val="right"/>
+              <w:jc w:val="both"/>
             </w:pPr>
             <w:r>
               <w:rPr>
@@ -379,12 +380,12 @@
         </w:tc>
         <w:tc>
           <w:tcPr>
-            <w:tcW w:type="dxa" w:w="4320"/>
+            <w:tcW w:type="dxa" w:w="5159"/>
           </w:tcPr>
           <w:p>
             <w:pPr>
               <w:bidi/>
-              <w:jc w:val="right"/>
+              <w:jc w:val="both"/>
             </w:pPr>
             <w:r>
               <w:rPr>

</xml_diff>